<commit_message>
1.4-band va QDU maqolasini kengaytirish: har bir zamonaviy metod ilmiy jihatdan boyitildi
- Dialektometriya: Séguy va Goebl metodikasi texnik tafsilotlar bilan
- GIS/Gabmap: Levenshtein masofasi algoritmi qo'shildi
- Sotsiofonetika: TELSUR loyihasi va formant tahlili tafsilotlari
- Perseptiv dialektologiya: draw-a-map metodikasi tafsilotlari
- Yangi sheva shakllanishi: uch bosqichli model va koineizatsiya tushunchasi
- 'ob'ektiv/sub'ektiv' imlosi 'obyektiv/subyektiv' shakliga tuzatildi

Co-Authored-By: Claude Sonnet 5 <noreply@anthropic.com>
Claude-Session: https://claude.ai/code/session_01YNzCBUJD6YhooefBuDBfxy
</commit_message>
<xml_diff>
--- a/maqolalar/Xorazm_metodlari_QDU_konferensiya.docx
+++ b/maqolalar/Xorazm_metodlari_QDU_konferensiya.docx
@@ -63,7 +63,7 @@
           <w:sz w:val="28"/>
           <w:szCs w:val="28"/>
         </w:rPr>
-        <w:t xml:space="preserve">[lavozimi]</w:t>
+        <w:t xml:space="preserve">Abu Rayhon Beruniy nomidagi Urganch davlat universiteti</w:t>
       </w:r>
     </w:p>
     <w:p>
@@ -79,23 +79,7 @@
           <w:sz w:val="28"/>
           <w:szCs w:val="28"/>
         </w:rPr>
-        <w:t xml:space="preserve">Abu Rayhon Beruniy nomidagi Urganch davlat universiteti</w:t>
-      </w:r>
-    </w:p>
-    <w:p>
-      <w:pPr>
-        <w:spacing w:after="0" w:line="360" w:lineRule="auto"/>
-        <w:jc w:val="center"/>
-      </w:pPr>
-      <w:r>
-        <w:rPr>
-          <w:rFonts w:ascii="Times New Roman" w:cs="Times New Roman" w:eastAsia="Times New Roman" w:hAnsi="Times New Roman"/>
-          <w:b w:val="false"/>
-          <w:bCs w:val="false"/>
-          <w:sz w:val="28"/>
-          <w:szCs w:val="28"/>
-        </w:rPr>
-        <w:t xml:space="preserve">Elektron pochta: [elektron manzilingiz]</w:t>
+        <w:t xml:space="preserve">Elektron pochta: shaxnozaalimova103@urdu.uz</w:t>
       </w:r>
     </w:p>
     <w:p>
@@ -111,7 +95,7 @@
           <w:sz w:val="28"/>
           <w:szCs w:val="28"/>
         </w:rPr>
-        <w:t xml:space="preserve">Telefon: [telefon raqamingiz]</w:t>
+        <w:t xml:space="preserve">Telefon: +998 94 316 48 30</w:t>
       </w:r>
     </w:p>
     <w:p>
@@ -346,7 +330,7 @@
           <w:sz w:val="28"/>
           <w:szCs w:val="28"/>
         </w:rPr>
-        <w:t xml:space="preserve">Birinchi muhim yangilik — dialektometriya (dialectometry) deb nomlangan miqdoriy (kvantitativ) yondashuvning shakllanishidir. Fransuz tilshunosi Jan Segi (J. Séguy) Gaskon shevalari atlasi materiallari asosida har ikki punkt orasidagi lisoniy farqlarni statistik o'lchash g'oyasini ilgari surgan bo'lsa [], avstriyalik tilshunos Xans Gyobl (H. Goebl) boshchiligidagi Zalsburg maktabi bu g'oyani rivojlantirib, ko'p o'zgaruvchili statistik tahlil (multivariate analysis) asosida "o'xshashlik xaritalari" va "uyachali xaritalar" (honeycomb maps) tuzish metodikasini ishlab chiqdi []. Bu metod bir nechta til hodisasini (fonetik, leksik, morfologik) bir vaqtda hisobga olib, hududlar orasidagi lisoniy yaqinlik yoki uzoqlik darajasini sonli ko'rsatkichlar bilan ifodalash imkonini beradi — bu esa an'anaviy, faqat bitta-ikkita izoglossaga asoslangan subyektiv tasnifdan farqli o'laroq, areal chegaralarni ob'ektiv, statistik asosda belgilashga xizmat qiladi.</w:t>
+        <w:t xml:space="preserve">Birinchi muhim yangilik — dialektometriya (dialectometry) deb nomlangan miqdoriy (kvantitativ) yondashuvning shakllanishidir. Fransuz tilshunosi Jan Segi (J. Séguy) "Gaskon lingvistik atlasi" (Atlas linguistique de la Gascogne) materiallari asosida har ikki tekshiruv punkti orasidagi lisoniy farqni foizli ko'rsatkich — "lisoniy masofa" (distance linguistique) sifatida hisoblash g'oyasini ilgari surgan bo'lsa [], avstriyalik tilshunos Xans Gyobl (H. Goebl) boshchiligidagi Zalsburg dialektometriya maktabi bu g'oyani matematik jihatdan rivojlantirib, ko'p o'zgaruvchili statistik tahlil (multivariate analysis), klasterlash (cluster analysis) va ko'p o'lchovli masshtablashtirish (multidimensional scaling) usullarini qo'lladi []. Mazkur maktab tomonidan ishlab chiqilgan "o'xshashlik xaritalari" (similarity maps) tanlangan bazaviy nuqtaning boshqa barcha nuqtalarga nisbatan lisoniy yaqinlik darajasini rang gradatsiyasi orqali, "uyachali xaritalar" (honeycomb maps) esa ierarxik klasterlash natijasida hosil bo'lgan dialektal guruhlarni hudud bo'ylab rangli uyachalar shaklida tasvirlaydi []. Bunday yondashuvning mohiyati shundaki, har bir tekshiruv nuqtasi ko'p o'lchovli lisoniy ko'rsatkichlar vektori sifatida qaraladi va nuqtalar orasidagi masofa aniq matematik formulalar (masalan, farqlanuvchi belgilar nisbati yoki vaznli o'xshashlik indeksi) asosida hisoblanadi — bu esa an'anaviy, faqat bitta-ikkita izoglossaga asoslangan subyektiv tasnifdan farqli o'laroq, areal chegaralarni obyektiv, statistik asosda belgilashga xizmat qiladi. Dialektometrik metod keyinchalik Italiya-Shveytsariya lingvistik atlasi (AIS) va Ruminiya lingvistik atlasi (ALR) materiallarini qayta tahlil qilishda ham samarali qo'llanilgan [].</w:t>
       </w:r>
     </w:p>
     <w:p>
@@ -365,7 +349,7 @@
           <w:sz w:val="28"/>
           <w:szCs w:val="28"/>
         </w:rPr>
-        <w:t xml:space="preserve">Ikkinchi yo'nalish — geografik axborot tizimlari (GIS) va kompyuter kartografiyasining lingvogeografik tadqiqotlarga tatbiq etilishidir. Xususan, Gronningen universiteti olimlari (J. Nerbonne, P. Kleiweg, V. Heeringa) ishlab chiqqan "Gabmap" kabi maxsus dasturiy vositalar sheva ma'lumotlarini raqamli xaritalarga aylantirish, bir nechta lisoniy o'zgaruvchini bir vaqtda vizuallashtirish va klaster tahlili (cluster analysis) orqali dialektal guruhlarni avtomatik aniqlash imkonini beradi []. Bunday vositalar qo'lda chiziladigan an'anaviy xaritalarga qaraganda aniqroq va qayta tekshirish imkoniyatiga ega bo'lgan natijalar berishi bilan ahamiyatlidir.</w:t>
+        <w:t xml:space="preserve">Ikkinchi yo'nalish — geografik axborot tizimlari (GIS) va kompyuter kartografiyasining lingvogeografik tadqiqotlarga tatbiq etilishidir. Gronningen universiteti (Niderlandiya) tilshunoslari J. Nerbonne, P. Kleiweg va V. Xeeringa tomonidan ishlab chiqilgan "Gabmap" onlayn tizimi, shuningdek undan oldin "Levenshteyn masofasi" (Levenshtein distance) algoritmini fonetik transkripsiyalarni qiyoslashga moslashtirish g'oyasi muhim texnik yangilik hisoblanadi []. Dastlab kompyuter fanlari va biologiyada (DNK ketma-ketliklarini taqqoslashda) qo'llanilgan ushbu algoritm bir so'zning ikki shevadagi fonetik variantini bir-biriga aylantirish uchun zarur bo'lgan minimal "tahrir amallari" (tovush qo'shish, o'chirish, almashtirish) sonini hisoblaydi, bu son esa ikki talaffuz o'rtasidagi "fonetik masofa" sifatida talqin qilinadi []. Barcha so'zlar bo'yicha bunday masofalarni yig'ib, agregatlashtirilgan fonetik masofa olinadi va shu asosda avtomatik klaster xaritalari, dendrogrammalar hamda ko'p o'lchovli masshtablashtirish (MDS) tasvirlari tuziladi. Gabmap kabi vositalarning afzalligi shundaki, ular maxsus dasturlash bilimiga ega bo'lmagan dialektolog olimlarga ham o'z ma'lumotlar bazasini yuklab, qisqa vaqt ichida statistik jihatdan tekshirilgan, takroriy hosil qilinadigan natijalar olish imkonini beradi — bu qo'lda chiziladigan an'anaviy xaritalarga qaraganda aniqroq va obyektivroq yondashuvdir.</w:t>
       </w:r>
     </w:p>
     <w:p>
@@ -384,7 +368,7 @@
           <w:sz w:val="28"/>
           <w:szCs w:val="28"/>
         </w:rPr>
-        <w:t xml:space="preserve">Uchinchi muhim yo'nalish — sotsiofonetik o'lchovlarni areal xaritalash bilan birlashtirish bo'lib, bunga eng yaxshi misol V. Labov, Sh. Esh va Ch. Boberg tomonidan yaratilgan "Shimoliy Amerika ingliz tili atlasi" (The Atlas of North American English, 2006) hisoblanadi []. Ushbu tadqiqotda unlilarning aniq akustik-fonetik o'lchovlari (formantalar tahlili) ommaviy tarzda to'planib, keyin areal xaritalarga tushirilgan — bu yondashuv fonetik areallarni nafaqat eshitib farqlash, balki asbob-uskunali o'lchash orqali aniqlashtirish imkonini yaratdi.</w:t>
+        <w:t xml:space="preserve">Uchinchi muhim yo'nalish — sotsiofonetik o'lchovlarni areal xaritalash bilan birlashtirish bo'lib, bunga eng yaxshi misol V. Labov, Sh. Esh va Ch. Boberg tomonidan amalga oshirilgan "TELSUR" (Telephone Survey) loyihasi asosida yaratilgan "Shimoliy Amerika ingliz tili atlasi" (The Atlas of North American English, 2006) hisoblanadi []. Tadqiqotchilar yuzlab shaharlarda telefon orqali strukturalashtirilgan intervyular o'tkazib, informantlar nutqini audio yozib olgan, so'ngra har bir unlining akustik xususiyatlarini (birinchi va ikkinchi formant chastotalari — F1, F2) maxsus dastur yordamida o'lchab, ularni unli fazosi (vowel space) koordinatalarida aks ettirgan []. Natijada "Shimoliy shaharlar unlilar siljishi" (Northern Cities Shift), "Janubiy unlilar siljishi" (Southern Shift) kabi yirik areal fonetik hodisalar endi faqat eshitib farqlash asosida emas, balki aniq o'lchov ma'lumotlari bilan tasdiqlangan holda xaritaga tushirildi. Bu yondashuv shuni ko'rsatadiki, fonetik areallarni belgilashda subyektiv eshitish tahliliga qo'shimcha ravishda instrumental-akustik tekshiruv olib borish zamonaviy areal fonetika uchun metodologik standart darajasiga ko'tarilgan.</w:t>
       </w:r>
     </w:p>
     <w:p>
@@ -403,7 +387,7 @@
           <w:sz w:val="28"/>
           <w:szCs w:val="28"/>
         </w:rPr>
-        <w:t xml:space="preserve">To'rtinchi yo'nalish — amerikalik tilshunos D. Preston asos solgan perseptiv dialektologiya (perceptual dialectology) bo'lib, bu yondashuvda oddiy til sohiblarining o'z shevalari va qo'shni shevalar chegaralari haqidagi sub'ektiv tasavvurlari ("xalq xaritalari", folk maps) ilmiy tahlil predmeti qilib olinadi []. Bu metod struktur-lisoniy izoglossalar bilan til sohiblarining o'z arealini qanday idrok etishi o'rtasidagi munosabatni aniqlashga yordam beradi va ko'pincha "oraliq shevalar" kabi o'tish zonalarining aynan qayerdan boshlanishi haqida qo'shimcha dalil beradi.</w:t>
+        <w:t xml:space="preserve">To'rtinchi yo'nalish — amerikalik tilshunos D. Preston asos solgan perseptiv dialektologiya (perceptual dialectology) bo'lib, bu yondashuvda oddiy til sohiblarining o'z shevalari va qo'shni shevalar chegaralari haqidagi subyektiv tasavvurlari ilmiy tahlil predmeti qilib olinadi []. Prestonning asosiy metodik vositasi — respondentlarga bo'sh (chiziqsiz) xarita berib, ular o'zlari sheva chegaralari deb hisoblagan chiziqlarni chizishni so'rash ("xarita chizish topshirig'i", draw-a-map task) bo'lib, keyin bir nechta respondent chizgan chiziqlar bir-biriga qoplanib, umumlashgan "xalq xaritasi" (folk map) hosil qilinadi []. Bundan tashqari, respondentlardan turli hududlar nutqini "to'g'rilik", "yoqimlilik" kabi mezonlar bo'yicha baholash ham so'raladi, bu baholar esa geografik jihatdan xaritalashtiriladi. Bu metod struktur-lisoniy izoglossalar bilan til sohiblarining o'z arealini qanday idrok etishi o'rtasidagi munosabatni aniqlashga yordam beradi hamda ko'pincha ma'muriy-siyosiy chegaralarning (masalan, viloyat yoki respublika chegaralari) sof lisoniy chegaralardan qanchalik farq qilishini yoki ularga mos kelishini ko'rsatadi — bu esa "oraliq shevalar" kabi o'tish zonalarining til sohiblari tasavvurida qanday aks etishini aniqlashtirish uchun qo'shimcha dalil beradi.</w:t>
       </w:r>
     </w:p>
     <w:p>
@@ -422,7 +406,7 @@
           <w:sz w:val="28"/>
           <w:szCs w:val="28"/>
         </w:rPr>
-        <w:t xml:space="preserve">Beshinchi, nazariy jihatdan muhim yangilik — P. Tradgillning yangi sheva shakllanishi nazariyasi (new-dialect formation) bo'lib, unga ko'ra turli shevalar tashuvchilari bir hududda uzoq muddat aralashib yashaganda, ularning nutqida dastlab o'zgaruvchanlik (variability), keyin esa tanlanish (selection) va nivelirovka (levelling) jarayonlari natijasida butunlay yangi, kontakt asosida shakllangan sheva vujudga keladi []. Ushbu nazariya Xorazm oraliq shevalarining tabiatini tushuntirishda alohida metodologik ahamiyat kasb etadi, chunki F. Abdullayev tomonidan aniqlangan "oraliq shevalar" aynan o'g'uz va qipchoq lahjalari tashuvchilarining tarixiy kontakti natijasida yuzaga kelgan kontakt hodisasi sifatida izohlanishi mumkin.</w:t>
+        <w:t xml:space="preserve">Beshinchi, nazariy jihatdan muhim yangilik — P. Tradgillning "Dialektlar kontaktda" (Dialects in Contact, 1986) va "Yangi sheva shakllanishi" (New-Dialect Formation, 2004) asarlarida ishlab chiqilgan yangi sheva shakllanishi nazariyasi (new-dialect formation) bo'lib, bu nazariya uch bosqichli modelni taklif qiladi []. Birinchi bosqichda (dastlabki ko'chib kelganlar avlodi) turli shevalarga xos shakllar oddiygina yonma-yon mavjud bo'ladi; ikkinchi bosqichda (ularning farzandlari avlodi) kuchli o'zgaruvchanlik va nivelirovka (levelling) jarayoni kuzatiladi, bunda hatto asl shevalarning birortasida ham mavjud bo'lmagan, aralashuv natijasida yuzaga kelgan yangi "oraliq shakllar" (interdialect forms) paydo bo'ladi; uchinchi bosqichda esa — odatda uchinchi avlodda — variantlar orasidan biri ustunlik qilib, yagona norma sifatida mustahkamlanadi (fokuslanish, focusing) []. Ushbu model, shuningdek, J. Sigelning "koineizatsiya" (koineization) tushunchasi bilan ham uyg'unlashadi []. Mazkur nazariya Xorazm oraliq shevalarining tabiatini tushuntirishda alohida metodologik ahamiyat kasb etadi, chunki F. Abdullayev tomonidan aniqlangan "oraliq shevalar" aynan o'g'uz va qipchoq lahjalari tashuvchilarining tarixiy kontakti va keyinchalik nivelirovka jarayoni natijasida shakllangan kontakt hodisasi sifatida izohlanishi mumkin.</w:t>
       </w:r>
     </w:p>
     <w:p>
@@ -491,7 +475,7 @@
           <w:sz w:val="28"/>
           <w:szCs w:val="28"/>
         </w:rPr>
-        <w:t xml:space="preserve">Jahon tilshunosligidagi zamonaviy areal tadqiq metodlarini (dialektometriya, GIS-kartografiya, sotsiofonetik o'lchov, perseptiv dialektologiya, yangi sheva shakllanishi nazariyasi) an'anaviy dala-tasviriy metodlar bilan uyg'unlashtirish Xorazm vohasi o'zbek shevalarini yanada aniq, ob'ektiv va ilmiy asoslangan tarzda areal tadqiq etish imkonini beradi.</w:t>
+        <w:t xml:space="preserve">Jahon tilshunosligidagi zamonaviy areal tadqiq metodlarini (dialektometriya, GIS-kartografiya, sotsiofonetik o'lchov, perseptiv dialektologiya, yangi sheva shakllanishi nazariyasi) an'anaviy dala-tasviriy metodlar bilan uyg'unlashtirish Xorazm vohasi o'zbek shevalarini yanada aniq, obyektiv va ilmiy asoslangan tarzda areal tadqiq etish imkonini beradi.</w:t>
       </w:r>
     </w:p>
     <w:p>
@@ -560,7 +544,7 @@
           <w:sz w:val="28"/>
           <w:szCs w:val="28"/>
         </w:rPr>
-        <w:t xml:space="preserve">— Séguy J. [Gaskon shevalari atlasi va dialektometriya asoslari haqidagi ishi] – [nashr yili].</w:t>
+        <w:t xml:space="preserve">— Séguy J. La dialectométrie dans l'Atlas linguistique de la Gascogne // Revue de linguistique romane. – [jild/son], 1973.</w:t>
       </w:r>
     </w:p>
     <w:p>
@@ -575,7 +559,7 @@
           <w:sz w:val="28"/>
           <w:szCs w:val="28"/>
         </w:rPr>
-        <w:t xml:space="preserve">— Goebl H. [Zalsburg maktabi dialektometriyasiga oid ishi] – [nashr yili].</w:t>
+        <w:t xml:space="preserve">— Goebl H. [Zalsburg maktabi dialektometriyasiga oid asosiy ishi] – [nashr yili].</w:t>
       </w:r>
     </w:p>
     <w:p>
@@ -620,7 +604,7 @@
           <w:sz w:val="28"/>
           <w:szCs w:val="28"/>
         </w:rPr>
-        <w:t xml:space="preserve">— Preston D. [Perseptiv dialektologiyaga oid asosiy ishi] – [nashr yili].</w:t>
+        <w:t xml:space="preserve">— Preston D. [Perseptiv dialektologiyaga oid asosiy ishi / Handbook of Perceptual Dialectology] – [nashr yili].</w:t>
       </w:r>
     </w:p>
     <w:p>
@@ -635,7 +619,37 @@
           <w:sz w:val="28"/>
           <w:szCs w:val="28"/>
         </w:rPr>
-        <w:t xml:space="preserve">— Trudgill P. New-Dialect Formation: The Inevitability of Colonial Englishes. – [nashriyot], [yil].</w:t>
+        <w:t xml:space="preserve">— Trudgill P. Dialects in Contact. – Oxford: Blackwell, 1986.</w:t>
+      </w:r>
+    </w:p>
+    <w:p>
+      <w:pPr>
+        <w:spacing w:after="100" w:line="360" w:lineRule="auto"/>
+      </w:pPr>
+      <w:r>
+        <w:rPr>
+          <w:rFonts w:ascii="Times New Roman" w:cs="Times New Roman" w:eastAsia="Times New Roman" w:hAnsi="Times New Roman"/>
+          <w:i/>
+          <w:iCs/>
+          <w:sz w:val="28"/>
+          <w:szCs w:val="28"/>
+        </w:rPr>
+        <w:t xml:space="preserve">— Trudgill P. New-Dialect Formation: The Inevitability of Colonial Englishes. – Edinburgh: Edinburgh University Press, 2004.</w:t>
+      </w:r>
+    </w:p>
+    <w:p>
+      <w:pPr>
+        <w:spacing w:after="100" w:line="360" w:lineRule="auto"/>
+      </w:pPr>
+      <w:r>
+        <w:rPr>
+          <w:rFonts w:ascii="Times New Roman" w:cs="Times New Roman" w:eastAsia="Times New Roman" w:hAnsi="Times New Roman"/>
+          <w:i/>
+          <w:iCs/>
+          <w:sz w:val="28"/>
+          <w:szCs w:val="28"/>
+        </w:rPr>
+        <w:t xml:space="preserve">— Siegel J. [Koineizatsiya tushunchasiga oid maqolasi, "Koines and koineization"] – [nashr yili].</w:t>
       </w:r>
     </w:p>
     <w:sectPr>

</xml_diff>

<commit_message>
Jahon areal lingvistikasi manbalarini tasdiqlab, havolalari bilan qo'shish
Veb-qidiruv orqali tekshirilgan 8 ta manba (Séguy, Goebl, Nerbonne/Kleiweg/
Heeringa, Labov/Ash/Boberg, Preston, Trudgill x2, Siegel) adabiyotlar.md
fayliga havolalari bilan qo'shildi. QDU maqolasidagi tegishli [] iqtibos
o'rinlari muallif-yil formatida to'ldirildi, adabiyotlar ro'yxati yangilandi.

Co-Authored-By: Claude Sonnet 5 <noreply@anthropic.com>
Claude-Session: https://claude.ai/code/session_01YNzCBUJD6YhooefBuDBfxy
</commit_message>
<xml_diff>
--- a/maqolalar/Xorazm_metodlari_QDU_konferensiya.docx
+++ b/maqolalar/Xorazm_metodlari_QDU_konferensiya.docx
@@ -330,7 +330,7 @@
           <w:sz w:val="28"/>
           <w:szCs w:val="28"/>
         </w:rPr>
-        <w:t xml:space="preserve">Birinchi muhim yangilik — dialektometriya (dialectometry) deb nomlangan miqdoriy (kvantitativ) yondashuvning shakllanishidir. Fransuz tilshunosi Jan Segi (J. Séguy) "Gaskon lingvistik atlasi" (Atlas linguistique de la Gascogne) materiallari asosida har ikki tekshiruv punkti orasidagi lisoniy farqni foizli ko'rsatkich — "lisoniy masofa" (distance linguistique) sifatida hisoblash g'oyasini ilgari surgan bo'lsa [], avstriyalik tilshunos Xans Gyobl (H. Goebl) boshchiligidagi Zalsburg dialektometriya maktabi bu g'oyani matematik jihatdan rivojlantirib, ko'p o'zgaruvchili statistik tahlil (multivariate analysis), klasterlash (cluster analysis) va ko'p o'lchovli masshtablashtirish (multidimensional scaling) usullarini qo'lladi []. Mazkur maktab tomonidan ishlab chiqilgan "o'xshashlik xaritalari" (similarity maps) tanlangan bazaviy nuqtaning boshqa barcha nuqtalarga nisbatan lisoniy yaqinlik darajasini rang gradatsiyasi orqali, "uyachali xaritalar" (honeycomb maps) esa ierarxik klasterlash natijasida hosil bo'lgan dialektal guruhlarni hudud bo'ylab rangli uyachalar shaklida tasvirlaydi []. Bunday yondashuvning mohiyati shundaki, har bir tekshiruv nuqtasi ko'p o'lchovli lisoniy ko'rsatkichlar vektori sifatida qaraladi va nuqtalar orasidagi masofa aniq matematik formulalar (masalan, farqlanuvchi belgilar nisbati yoki vaznli o'xshashlik indeksi) asosida hisoblanadi — bu esa an'anaviy, faqat bitta-ikkita izoglossaga asoslangan subyektiv tasnifdan farqli o'laroq, areal chegaralarni obyektiv, statistik asosda belgilashga xizmat qiladi. Dialektometrik metod keyinchalik Italiya-Shveytsariya lingvistik atlasi (AIS) va Ruminiya lingvistik atlasi (ALR) materiallarini qayta tahlil qilishda ham samarali qo'llanilgan [].</w:t>
+        <w:t xml:space="preserve">Birinchi muhim yangilik — dialektometriya (dialectometry) deb nomlangan miqdoriy (kvantitativ) yondashuvning shakllanishidir. Fransuz tilshunosi Jan Segi (J. Séguy) "Gaskon lingvistik atlasi" (Atlas linguistique de la Gascogne) materiallari asosida har ikki tekshiruv punkti orasidagi lisoniy farqni foizli ko'rsatkich — "lisoniy masofa" (distance linguistique) sifatida hisoblash g'oyasini ilgari surgan bo'lsa [Séguy, 1973], avstriyalik tilshunos Xans Gyobl (H. Goebl) boshchiligidagi Zalsburg dialektometriya maktabi bu g'oyani matematik jihatdan rivojlantirib, ko'p o'zgaruvchili statistik tahlil (multivariate analysis), klasterlash (cluster analysis) va ko'p o'lchovli masshtablashtirish (multidimensional scaling) usullarini qo'lladi [Goebl, 2006]. Mazkur maktab tomonidan ishlab chiqilgan "o'xshashlik xaritalari" (similarity maps) tanlangan bazaviy nuqtaning boshqa barcha nuqtalarga nisbatan lisoniy yaqinlik darajasini rang gradatsiyasi orqali, "uyachali xaritalar" (honeycomb maps) esa ierarxik klasterlash natijasida hosil bo'lgan dialektal guruhlarni hudud bo'ylab rangli uyachalar shaklida tasvirlaydi [Goebl, 2006]. Bunday yondashuvning mohiyati shundaki, har bir tekshiruv nuqtasi ko'p o'lchovli lisoniy ko'rsatkichlar vektori sifatida qaraladi va nuqtalar orasidagi masofa aniq matematik formulalar (masalan, farqlanuvchi belgilar nisbati yoki vaznli o'xshashlik indeksi) asosida hisoblanadi — bu esa an'anaviy, faqat bitta-ikkita izoglossaga asoslangan subyektiv tasnifdan farqli o'laroq, areal chegaralarni obyektiv, statistik asosda belgilashga xizmat qiladi. Dialektometrik metod keyinchalik Italiya-Shveytsariya lingvistik atlasi (AIS) va Ruminiya lingvistik atlasi (ALR) materiallarini qayta tahlil qilishda ham samarali qo'llanilgan [].</w:t>
       </w:r>
     </w:p>
     <w:p>
@@ -349,7 +349,7 @@
           <w:sz w:val="28"/>
           <w:szCs w:val="28"/>
         </w:rPr>
-        <w:t xml:space="preserve">Ikkinchi yo'nalish — geografik axborot tizimlari (GIS) va kompyuter kartografiyasining lingvogeografik tadqiqotlarga tatbiq etilishidir. Gronningen universiteti (Niderlandiya) tilshunoslari J. Nerbonne, P. Kleiweg va V. Xeeringa tomonidan ishlab chiqilgan "Gabmap" onlayn tizimi, shuningdek undan oldin "Levenshteyn masofasi" (Levenshtein distance) algoritmini fonetik transkripsiyalarni qiyoslashga moslashtirish g'oyasi muhim texnik yangilik hisoblanadi []. Dastlab kompyuter fanlari va biologiyada (DNK ketma-ketliklarini taqqoslashda) qo'llanilgan ushbu algoritm bir so'zning ikki shevadagi fonetik variantini bir-biriga aylantirish uchun zarur bo'lgan minimal "tahrir amallari" (tovush qo'shish, o'chirish, almashtirish) sonini hisoblaydi, bu son esa ikki talaffuz o'rtasidagi "fonetik masofa" sifatida talqin qilinadi []. Barcha so'zlar bo'yicha bunday masofalarni yig'ib, agregatlashtirilgan fonetik masofa olinadi va shu asosda avtomatik klaster xaritalari, dendrogrammalar hamda ko'p o'lchovli masshtablashtirish (MDS) tasvirlari tuziladi. Gabmap kabi vositalarning afzalligi shundaki, ular maxsus dasturlash bilimiga ega bo'lmagan dialektolog olimlarga ham o'z ma'lumotlar bazasini yuklab, qisqa vaqt ichida statistik jihatdan tekshirilgan, takroriy hosil qilinadigan natijalar olish imkonini beradi — bu qo'lda chiziladigan an'anaviy xaritalarga qaraganda aniqroq va obyektivroq yondashuvdir.</w:t>
+        <w:t xml:space="preserve">Ikkinchi yo'nalish — geografik axborot tizimlari (GIS) va kompyuter kartografiyasining lingvogeografik tadqiqotlarga tatbiq etilishidir. Gronningen universiteti (Niderlandiya) tilshunoslari J. Nerbonne, P. Kleiweg va V. Xeeringa tomonidan ishlab chiqilgan "Gabmap" onlayn tizimi, shuningdek undan oldin "Levenshteyn masofasi" (Levenshtein distance) algoritmini fonetik transkripsiyalarni qiyoslashga moslashtirish g'oyasi muhim texnik yangilik hisoblanadi [Nerbonne, Kleiweg, Heeringa, 2011]. Dastlab kompyuter fanlari va biologiyada (DNK ketma-ketliklarini taqqoslashda) qo'llanilgan ushbu algoritm bir so'zning ikki shevadagi fonetik variantini bir-biriga aylantirish uchun zarur bo'lgan minimal "tahrir amallari" (tovush qo'shish, o'chirish, almashtirish) sonini hisoblaydi, bu son esa ikki talaffuz o'rtasidagi "fonetik masofa" sifatida talqin qilinadi [Nerbonne, Kleiweg, Heeringa, 2011]. Barcha so'zlar bo'yicha bunday masofalarni yig'ib, agregatlashtirilgan fonetik masofa olinadi va shu asosda avtomatik klaster xaritalari, dendrogrammalar hamda ko'p o'lchovli masshtablashtirish (MDS) tasvirlari tuziladi. Gabmap kabi vositalarning afzalligi shundaki, ular maxsus dasturlash bilimiga ega bo'lmagan dialektolog olimlarga ham o'z ma'lumotlar bazasini yuklab, qisqa vaqt ichida statistik jihatdan tekshirilgan, takroriy hosil qilinadigan natijalar olish imkonini beradi — bu qo'lda chiziladigan an'anaviy xaritalarga qaraganda aniqroq va obyektivroq yondashuvdir.</w:t>
       </w:r>
     </w:p>
     <w:p>
@@ -368,7 +368,7 @@
           <w:sz w:val="28"/>
           <w:szCs w:val="28"/>
         </w:rPr>
-        <w:t xml:space="preserve">Uchinchi muhim yo'nalish — sotsiofonetik o'lchovlarni areal xaritalash bilan birlashtirish bo'lib, bunga eng yaxshi misol V. Labov, Sh. Esh va Ch. Boberg tomonidan amalga oshirilgan "TELSUR" (Telephone Survey) loyihasi asosida yaratilgan "Shimoliy Amerika ingliz tili atlasi" (The Atlas of North American English, 2006) hisoblanadi []. Tadqiqotchilar yuzlab shaharlarda telefon orqali strukturalashtirilgan intervyular o'tkazib, informantlar nutqini audio yozib olgan, so'ngra har bir unlining akustik xususiyatlarini (birinchi va ikkinchi formant chastotalari — F1, F2) maxsus dastur yordamida o'lchab, ularni unli fazosi (vowel space) koordinatalarida aks ettirgan []. Natijada "Shimoliy shaharlar unlilar siljishi" (Northern Cities Shift), "Janubiy unlilar siljishi" (Southern Shift) kabi yirik areal fonetik hodisalar endi faqat eshitib farqlash asosida emas, balki aniq o'lchov ma'lumotlari bilan tasdiqlangan holda xaritaga tushirildi. Bu yondashuv shuni ko'rsatadiki, fonetik areallarni belgilashda subyektiv eshitish tahliliga qo'shimcha ravishda instrumental-akustik tekshiruv olib borish zamonaviy areal fonetika uchun metodologik standart darajasiga ko'tarilgan.</w:t>
+        <w:t xml:space="preserve">Uchinchi muhim yo'nalish — sotsiofonetik o'lchovlarni areal xaritalash bilan birlashtirish bo'lib, bunga eng yaxshi misol V. Labov, Sh. Esh va Ch. Boberg tomonidan amalga oshirilgan "TELSUR" (Telephone Survey) loyihasi asosida yaratilgan "Shimoliy Amerika ingliz tili atlasi" (The Atlas of North American English, 2006) hisoblanadi [Labov, Ash, Boberg, 2006]. Tadqiqotchilar yuzlab shaharlarda telefon orqali strukturalashtirilgan intervyular o'tkazib, informantlar nutqini audio yozib olgan, so'ngra har bir unlining akustik xususiyatlarini (birinchi va ikkinchi formant chastotalari — F1, F2) maxsus dastur yordamida o'lchab, ularni unli fazosi (vowel space) koordinatalarida aks ettirgan [Labov, Ash, Boberg, 2006]. Natijada "Shimoliy shaharlar unlilar siljishi" (Northern Cities Shift), "Janubiy unlilar siljishi" (Southern Shift) kabi yirik areal fonetik hodisalar endi faqat eshitib farqlash asosida emas, balki aniq o'lchov ma'lumotlari bilan tasdiqlangan holda xaritaga tushirildi. Bu yondashuv shuni ko'rsatadiki, fonetik areallarni belgilashda subyektiv eshitish tahliliga qo'shimcha ravishda instrumental-akustik tekshiruv olib borish zamonaviy areal fonetika uchun metodologik standart darajasiga ko'tarilgan.</w:t>
       </w:r>
     </w:p>
     <w:p>
@@ -387,7 +387,7 @@
           <w:sz w:val="28"/>
           <w:szCs w:val="28"/>
         </w:rPr>
-        <w:t xml:space="preserve">To'rtinchi yo'nalish — amerikalik tilshunos D. Preston asos solgan perseptiv dialektologiya (perceptual dialectology) bo'lib, bu yondashuvda oddiy til sohiblarining o'z shevalari va qo'shni shevalar chegaralari haqidagi subyektiv tasavvurlari ilmiy tahlil predmeti qilib olinadi []. Prestonning asosiy metodik vositasi — respondentlarga bo'sh (chiziqsiz) xarita berib, ular o'zlari sheva chegaralari deb hisoblagan chiziqlarni chizishni so'rash ("xarita chizish topshirig'i", draw-a-map task) bo'lib, keyin bir nechta respondent chizgan chiziqlar bir-biriga qoplanib, umumlashgan "xalq xaritasi" (folk map) hosil qilinadi []. Bundan tashqari, respondentlardan turli hududlar nutqini "to'g'rilik", "yoqimlilik" kabi mezonlar bo'yicha baholash ham so'raladi, bu baholar esa geografik jihatdan xaritalashtiriladi. Bu metod struktur-lisoniy izoglossalar bilan til sohiblarining o'z arealini qanday idrok etishi o'rtasidagi munosabatni aniqlashga yordam beradi hamda ko'pincha ma'muriy-siyosiy chegaralarning (masalan, viloyat yoki respublika chegaralari) sof lisoniy chegaralardan qanchalik farq qilishini yoki ularga mos kelishini ko'rsatadi — bu esa "oraliq shevalar" kabi o'tish zonalarining til sohiblari tasavvurida qanday aks etishini aniqlashtirish uchun qo'shimcha dalil beradi.</w:t>
+        <w:t xml:space="preserve">To'rtinchi yo'nalish — amerikalik tilshunos D. Preston asos solgan perseptiv dialektologiya (perceptual dialectology) bo'lib, bu yondashuvda oddiy til sohiblarining o'z shevalari va qo'shni shevalar chegaralari haqidagi subyektiv tasavvurlari ilmiy tahlil predmeti qilib olinadi [Preston, 1999]. Prestonning asosiy metodik vositasi — respondentlarga bo'sh (chiziqsiz) xarita berib, ular o'zlari sheva chegaralari deb hisoblagan chiziqlarni chizishni so'rash ("xarita chizish topshirig'i", draw-a-map task) bo'lib, keyin bir nechta respondent chizgan chiziqlar bir-biriga qoplanib, umumlashgan "xalq xaritasi" (folk map) hosil qilinadi [Preston, 1999]. Bundan tashqari, respondentlardan turli hududlar nutqini "to'g'rilik", "yoqimlilik" kabi mezonlar bo'yicha baholash ham so'raladi, bu baholar esa geografik jihatdan xaritalashtiriladi. Bu metod struktur-lisoniy izoglossalar bilan til sohiblarining o'z arealini qanday idrok etishi o'rtasidagi munosabatni aniqlashga yordam beradi hamda ko'pincha ma'muriy-siyosiy chegaralarning (masalan, viloyat yoki respublika chegaralari) sof lisoniy chegaralardan qanchalik farq qilishini yoki ularga mos kelishini ko'rsatadi — bu esa "oraliq shevalar" kabi o'tish zonalarining til sohiblari tasavvurida qanday aks etishini aniqlashtirish uchun qo'shimcha dalil beradi.</w:t>
       </w:r>
     </w:p>
     <w:p>
@@ -406,7 +406,7 @@
           <w:sz w:val="28"/>
           <w:szCs w:val="28"/>
         </w:rPr>
-        <w:t xml:space="preserve">Beshinchi, nazariy jihatdan muhim yangilik — P. Tradgillning "Dialektlar kontaktda" (Dialects in Contact, 1986) va "Yangi sheva shakllanishi" (New-Dialect Formation, 2004) asarlarida ishlab chiqilgan yangi sheva shakllanishi nazariyasi (new-dialect formation) bo'lib, bu nazariya uch bosqichli modelni taklif qiladi []. Birinchi bosqichda (dastlabki ko'chib kelganlar avlodi) turli shevalarga xos shakllar oddiygina yonma-yon mavjud bo'ladi; ikkinchi bosqichda (ularning farzandlari avlodi) kuchli o'zgaruvchanlik va nivelirovka (levelling) jarayoni kuzatiladi, bunda hatto asl shevalarning birortasida ham mavjud bo'lmagan, aralashuv natijasida yuzaga kelgan yangi "oraliq shakllar" (interdialect forms) paydo bo'ladi; uchinchi bosqichda esa — odatda uchinchi avlodda — variantlar orasidan biri ustunlik qilib, yagona norma sifatida mustahkamlanadi (fokuslanish, focusing) []. Ushbu model, shuningdek, J. Sigelning "koineizatsiya" (koineization) tushunchasi bilan ham uyg'unlashadi []. Mazkur nazariya Xorazm oraliq shevalarining tabiatini tushuntirishda alohida metodologik ahamiyat kasb etadi, chunki F. Abdullayev tomonidan aniqlangan "oraliq shevalar" aynan o'g'uz va qipchoq lahjalari tashuvchilarining tarixiy kontakti va keyinchalik nivelirovka jarayoni natijasida shakllangan kontakt hodisasi sifatida izohlanishi mumkin.</w:t>
+        <w:t xml:space="preserve">Beshinchi, nazariy jihatdan muhim yangilik — P. Tradgillning "Dialektlar kontaktda" (Dialects in Contact, 1986) va "Yangi sheva shakllanishi" (New-Dialect Formation, 2004) asarlarida ishlab chiqilgan yangi sheva shakllanishi nazariyasi (new-dialect formation) bo'lib, bu nazariya uch bosqichli modelni taklif qiladi [Trudgill, 1986; Trudgill, 2004]. Birinchi bosqichda (dastlabki ko'chib kelganlar avlodi) turli shevalarga xos shakllar oddiygina yonma-yon mavjud bo'ladi; ikkinchi bosqichda (ularning farzandlari avlodi) kuchli o'zgaruvchanlik va nivelirovka (levelling) jarayoni kuzatiladi, bunda hatto asl shevalarning birortasida ham mavjud bo'lmagan, aralashuv natijasida yuzaga kelgan yangi "oraliq shakllar" (interdialect forms) paydo bo'ladi; uchinchi bosqichda esa — odatda uchinchi avlodda — variantlar orasidan biri ustunlik qilib, yagona norma sifatida mustahkamlanadi (fokuslanish, focusing) [Trudgill, 2004]. Ushbu model, shuningdek, J. Sigelning "koineizatsiya" (koineization) tushunchasi bilan ham uyg'unlashadi [Siegel, 1985: 357]. Mazkur nazariya Xorazm oraliq shevalarining tabiatini tushuntirishda alohida metodologik ahamiyat kasb etadi, chunki F. Abdullayev tomonidan aniqlangan "oraliq shevalar" aynan o'g'uz va qipchoq lahjalari tashuvchilarining tarixiy kontakti va keyinchalik nivelirovka jarayoni natijasida shakllangan kontakt hodisasi sifatida izohlanishi mumkin.</w:t>
       </w:r>
     </w:p>
     <w:p>
@@ -539,12 +539,10 @@
       <w:r>
         <w:rPr>
           <w:rFonts w:ascii="Times New Roman" w:cs="Times New Roman" w:eastAsia="Times New Roman" w:hAnsi="Times New Roman"/>
-          <w:i/>
-          <w:iCs/>
-          <w:sz w:val="28"/>
-          <w:szCs w:val="28"/>
-        </w:rPr>
-        <w:t xml:space="preserve">— Séguy J. La dialectométrie dans l'Atlas linguistique de la Gascogne // Revue de linguistique romane. – [jild/son], 1973.</w:t>
+          <w:sz w:val="28"/>
+          <w:szCs w:val="28"/>
+        </w:rPr>
+        <w:t xml:space="preserve">4. Séguy J. La dialectométrie dans l'Atlas linguistique de la Gascogne // Revue de Linguistique Romane. – 1973. – Vol. 37. – P. 1–24.</w:t>
       </w:r>
     </w:p>
     <w:p>
@@ -554,12 +552,10 @@
       <w:r>
         <w:rPr>
           <w:rFonts w:ascii="Times New Roman" w:cs="Times New Roman" w:eastAsia="Times New Roman" w:hAnsi="Times New Roman"/>
-          <w:i/>
-          <w:iCs/>
-          <w:sz w:val="28"/>
-          <w:szCs w:val="28"/>
-        </w:rPr>
-        <w:t xml:space="preserve">— Goebl H. [Zalsburg maktabi dialektometriyasiga oid asosiy ishi] – [nashr yili].</w:t>
+          <w:sz w:val="28"/>
+          <w:szCs w:val="28"/>
+        </w:rPr>
+        <w:t xml:space="preserve">5. Goebl H. Recent Advances in Salzburg Dialectometry. – 2006. URL: https://goebl.ads.plus.ac.at/people/prof/goebl/docs/Goebl_2006_Recent%20Advances%20in%20Salzburg%20Dialectometry%202006.pdf</w:t>
       </w:r>
     </w:p>
     <w:p>
@@ -569,12 +565,10 @@
       <w:r>
         <w:rPr>
           <w:rFonts w:ascii="Times New Roman" w:cs="Times New Roman" w:eastAsia="Times New Roman" w:hAnsi="Times New Roman"/>
-          <w:i/>
-          <w:iCs/>
-          <w:sz w:val="28"/>
-          <w:szCs w:val="28"/>
-        </w:rPr>
-        <w:t xml:space="preserve">— Nerbonne J., Kleiweg P., Heeringa W. [Gabmap haqidagi maqola/dastur tavsifi] – [nashr yili].</w:t>
+          <w:sz w:val="28"/>
+          <w:szCs w:val="28"/>
+        </w:rPr>
+        <w:t xml:space="preserve">6. Nerbonne J., Kleiweg P., Heeringa W. et al. Gabmap – A Web Application for Dialectology. – 2011. URL: https://www.let.rug.nl/nerbonne/papers/Gabmap-long-2011.pdf</w:t>
       </w:r>
     </w:p>
     <w:p>
@@ -584,12 +578,10 @@
       <w:r>
         <w:rPr>
           <w:rFonts w:ascii="Times New Roman" w:cs="Times New Roman" w:eastAsia="Times New Roman" w:hAnsi="Times New Roman"/>
-          <w:i/>
-          <w:iCs/>
-          <w:sz w:val="28"/>
-          <w:szCs w:val="28"/>
-        </w:rPr>
-        <w:t xml:space="preserve">— Labov W., Ash S., Boberg C. The Atlas of North American English. – Berlin: Mouton de Gruyter, 2006.</w:t>
+          <w:sz w:val="28"/>
+          <w:szCs w:val="28"/>
+        </w:rPr>
+        <w:t xml:space="preserve">7. Labov W., Ash S., Boberg C. The Atlas of North American English: Phonetics, Phonology and Sound Change. – Berlin: Mouton de Gruyter, 2006.</w:t>
       </w:r>
     </w:p>
     <w:p>
@@ -599,12 +591,10 @@
       <w:r>
         <w:rPr>
           <w:rFonts w:ascii="Times New Roman" w:cs="Times New Roman" w:eastAsia="Times New Roman" w:hAnsi="Times New Roman"/>
-          <w:i/>
-          <w:iCs/>
-          <w:sz w:val="28"/>
-          <w:szCs w:val="28"/>
-        </w:rPr>
-        <w:t xml:space="preserve">— Preston D. [Perseptiv dialektologiyaga oid asosiy ishi / Handbook of Perceptual Dialectology] – [nashr yili].</w:t>
+          <w:sz w:val="28"/>
+          <w:szCs w:val="28"/>
+        </w:rPr>
+        <w:t xml:space="preserve">8. Preston D.R. (ed.) Handbook of Perceptual Dialectology. Vol. 1. – Amsterdam/Philadelphia: John Benjamins, 1999.</w:t>
       </w:r>
     </w:p>
     <w:p>
@@ -614,12 +604,10 @@
       <w:r>
         <w:rPr>
           <w:rFonts w:ascii="Times New Roman" w:cs="Times New Roman" w:eastAsia="Times New Roman" w:hAnsi="Times New Roman"/>
-          <w:i/>
-          <w:iCs/>
-          <w:sz w:val="28"/>
-          <w:szCs w:val="28"/>
-        </w:rPr>
-        <w:t xml:space="preserve">— Trudgill P. Dialects in Contact. – Oxford: Blackwell, 1986.</w:t>
+          <w:sz w:val="28"/>
+          <w:szCs w:val="28"/>
+        </w:rPr>
+        <w:t xml:space="preserve">9. Trudgill P. Dialects in Contact. – Oxford: Blackwell, 1986.</w:t>
       </w:r>
     </w:p>
     <w:p>
@@ -629,12 +617,10 @@
       <w:r>
         <w:rPr>
           <w:rFonts w:ascii="Times New Roman" w:cs="Times New Roman" w:eastAsia="Times New Roman" w:hAnsi="Times New Roman"/>
-          <w:i/>
-          <w:iCs/>
-          <w:sz w:val="28"/>
-          <w:szCs w:val="28"/>
-        </w:rPr>
-        <w:t xml:space="preserve">— Trudgill P. New-Dialect Formation: The Inevitability of Colonial Englishes. – Edinburgh: Edinburgh University Press, 2004.</w:t>
+          <w:sz w:val="28"/>
+          <w:szCs w:val="28"/>
+        </w:rPr>
+        <w:t xml:space="preserve">10. Trudgill P. New-Dialect Formation: The Inevitability of Colonial Englishes. – Edinburgh: Edinburgh University Press, 2004.</w:t>
       </w:r>
     </w:p>
     <w:p>
@@ -644,12 +630,10 @@
       <w:r>
         <w:rPr>
           <w:rFonts w:ascii="Times New Roman" w:cs="Times New Roman" w:eastAsia="Times New Roman" w:hAnsi="Times New Roman"/>
-          <w:i/>
-          <w:iCs/>
-          <w:sz w:val="28"/>
-          <w:szCs w:val="28"/>
-        </w:rPr>
-        <w:t xml:space="preserve">— Siegel J. [Koineizatsiya tushunchasiga oid maqolasi, "Koines and koineization"] – [nashr yili].</w:t>
+          <w:sz w:val="28"/>
+          <w:szCs w:val="28"/>
+        </w:rPr>
+        <w:t xml:space="preserve">11. Siegel J. Koines and koineization // Language in Society. – 1985. – Vol. 14, No. 3. – P. 357–378. URL: https://www.unioviedo.es/felixfer/Facsimiles/Siegel_1985_Koines_Koineization.pdf</w:t>
       </w:r>
     </w:p>
     <w:sectPr>

</xml_diff>